<commit_message>
Use joint software ownership without shares in agreement template
</commit_message>
<xml_diff>
--- a/.agents/skills/software-copyright-materials/assets/agreement-template/合作开发协议模板.docx
+++ b/.agents/skills/software-copyright-materials/assets/agreement-template/合作开发协议模板.docx
@@ -411,101 +411,7 @@
       </w:r>
       <w:r>
         <w:rPr/>
-        <w:t xml:space="preserve">按份共有。</w:t>
-      </w:r>
-    </w:p>
-    <w:p>
-      <w:pPr>
-        <w:spacing w:before="60" w:after="60" w:line="360" w:lineRule="auto"/>
-        <w:ind w:firstLine="480"/>
-        <w:jc w:val="both"/>
-        <w:rPr>
-          <w:rFonts w:hint="eastAsia"/>
-        </w:rPr>
-      </w:pPr>
-      <w:r>
-        <w:rPr/>
-        <w:t xml:space="preserve">各方著作权份额为：</w:t>
-      </w:r>
-      <w:r>
-        <w:rPr>
-          <w:color w:val="FF0000"/>
-        </w:rPr>
-        <w:t xml:space="preserve">XXX</w:t>
-      </w:r>
-      <w:r>
-        <w:rPr/>
-        <w:t xml:space="preserve"> </w:t>
-      </w:r>
-      <w:r>
-        <w:rPr>
-          <w:color w:val="FF0000"/>
-        </w:rPr>
-        <w:t xml:space="preserve">XXX</w:t>
-      </w:r>
-      <w:r>
-        <w:rPr/>
-        <w:t xml:space="preserve">%；</w:t>
-      </w:r>
-      <w:r>
-        <w:rPr>
-          <w:color w:val="FF0000"/>
-        </w:rPr>
-        <w:t xml:space="preserve">XXX</w:t>
-      </w:r>
-      <w:r>
-        <w:rPr/>
-        <w:t xml:space="preserve"> </w:t>
-      </w:r>
-      <w:r>
-        <w:rPr>
-          <w:color w:val="FF0000"/>
-        </w:rPr>
-        <w:t xml:space="preserve">XXX</w:t>
-      </w:r>
-      <w:r>
-        <w:rPr/>
-        <w:t xml:space="preserve">%；</w:t>
-      </w:r>
-      <w:r>
-        <w:rPr>
-          <w:color w:val="FF0000"/>
-        </w:rPr>
-        <w:t xml:space="preserve">XXX</w:t>
-      </w:r>
-      <w:r>
-        <w:rPr/>
-        <w:t xml:space="preserve"> </w:t>
-      </w:r>
-      <w:r>
-        <w:rPr>
-          <w:color w:val="FF0000"/>
-        </w:rPr>
-        <w:t xml:space="preserve">XXX</w:t>
-      </w:r>
-      <w:r>
-        <w:rPr/>
-        <w:t xml:space="preserve">%；</w:t>
-      </w:r>
-      <w:r>
-        <w:rPr>
-          <w:color w:val="FF0000"/>
-        </w:rPr>
-        <w:t xml:space="preserve">XXX</w:t>
-      </w:r>
-      <w:r>
-        <w:rPr/>
-        <w:t xml:space="preserve"> </w:t>
-      </w:r>
-      <w:r>
-        <w:rPr>
-          <w:color w:val="FF0000"/>
-        </w:rPr>
-        <w:t xml:space="preserve">XXX</w:t>
-      </w:r>
-      <w:r>
-        <w:rPr/>
-        <w:t xml:space="preserve">%。上述比例合计为 100%。</w:t>
+        <w:t xml:space="preserve">共同享有。</w:t>
       </w:r>
     </w:p>
     <w:p>
@@ -787,7 +693,7 @@
         </w:rPr>
       </w:pPr>
       <w:r>
-        <w:t>本软件用于商业目的、对外授权、转让或收益分配时，按照各方著作权份额比例执行；涉及对外转让、独占许可、排他许可或其他可能影响各方权利的重大事项，应</w:t>
+        <w:t>本软件用于商业目的、对外授权、转让或收益分配时，由协议各方共同协商并以书面方式确定；涉及对外转让、独占许可、排他许可或其他可能影响各方权利的重大事项，应</w:t>
       </w:r>
       <w:r>
         <w:lastRenderedPageBreak/>

</xml_diff>

<commit_message>
Add cooperation agreement generator and sync latest skill rules
- scripts/agreement.py fills the DOCX template from agreement.json (2-4 parties),
  checks ID checksums, requires the signing date to precede the development
  completion date, and refuses to leave XXX placeholders; optional Word PDF export.
- Template: drop the "具体分工可由…" sentence and leave signature dates blank.
- Agreement rules: only produce on request, handler defaults to party one,
  duties drafted from real modules, no red XXX in deliverables; cite sources.
- Sync pending manual/source geometry, packaging and web-form stats checks.

Co-Authored-By: Claude Opus 5.5 <noreply@anthropic.com>
</commit_message>
<xml_diff>
--- a/.agents/skills/software-copyright-materials/assets/agreement-template/合作开发协议模板.docx
+++ b/.agents/skills/software-copyright-materials/assets/agreement-template/合作开发协议模板.docx
@@ -593,19 +593,6 @@
       <w:r>
         <w:rPr/>
         <w:t xml:space="preserve">。</w:t>
-      </w:r>
-    </w:p>
-    <w:p>
-      <w:pPr>
-        <w:spacing w:before="60" w:after="60" w:line="360" w:lineRule="auto"/>
-        <w:ind w:firstLine="480"/>
-        <w:jc w:val="both"/>
-        <w:rPr>
-          <w:rFonts w:hint="eastAsia"/>
-        </w:rPr>
-      </w:pPr>
-      <w:r>
-        <w:t>具体分工可由协议各方根据项目进度进行补充或调整，但不应改变本协议关于著作权归属、署名顺序和登记配合义务的约定。</w:t>
       </w:r>
     </w:p>
     <w:p>
@@ -948,10 +935,8 @@
               <w:t xml:space="preserve">日期：</w:t>
             </w:r>
             <w:r>
-              <w:rPr>
-                <w:color w:val="FF0000"/>
-              </w:rPr>
-              <w:t xml:space="preserve">XXX</w:t>
+              <w:rPr/>
+              <w:t xml:space="preserve">        年      月      日</w:t>
             </w:r>
           </w:p>
         </w:tc>
@@ -1031,10 +1016,8 @@
               <w:t xml:space="preserve">日期：</w:t>
             </w:r>
             <w:r>
-              <w:rPr>
-                <w:color w:val="FF0000"/>
-              </w:rPr>
-              <w:t xml:space="preserve">XXX</w:t>
+              <w:rPr/>
+              <w:t xml:space="preserve">        年      月      日</w:t>
             </w:r>
           </w:p>
         </w:tc>
@@ -1120,10 +1103,8 @@
               <w:t xml:space="preserve">日期：</w:t>
             </w:r>
             <w:r>
-              <w:rPr>
-                <w:color w:val="FF0000"/>
-              </w:rPr>
-              <w:t xml:space="preserve">XXX</w:t>
+              <w:rPr/>
+              <w:t xml:space="preserve">        年      月      日</w:t>
             </w:r>
           </w:p>
         </w:tc>
@@ -1203,10 +1184,8 @@
               <w:t xml:space="preserve">日期：</w:t>
             </w:r>
             <w:r>
-              <w:rPr>
-                <w:color w:val="FF0000"/>
-              </w:rPr>
-              <w:t xml:space="preserve">XXX</w:t>
+              <w:rPr/>
+              <w:t xml:space="preserve">        年      月      日</w:t>
             </w:r>
           </w:p>
         </w:tc>

</xml_diff>